<commit_message>
feat: add multi-branch and office location intelligence to AI lead enrichment
</commit_message>
<xml_diff>
--- a/public/downloads/MailPlus_ProspectPlus_AI_Lead_Enrichment_Guide.docx
+++ b/public/downloads/MailPlus_ProspectPlus_AI_Lead_Enrichment_Guide.docx
@@ -554,6 +554,115 @@
                 <w:color w:val="059669"/>
               </w:rPr>
               <w:t xml:space="preserve">true (📦 Verified Parcel Shipper)</w:t>
+            </w:r>
+          </w:p>
+        </w:tc>
+      </w:tr>
+      <w:tr>
+        <w:tc>
+          <w:tcPr>
+            <w:tcBorders>
+              <w:top w:val="single" w:color="CBD5E1" w:sz="4"/>
+              <w:left w:val="single" w:color="CBD5E1" w:sz="4"/>
+              <w:bottom w:val="single" w:color="CBD5E1" w:sz="4"/>
+              <w:right w:val="single" w:color="CBD5E1" w:sz="4"/>
+            </w:tcBorders>
+          </w:tcPr>
+          <w:p>
+            <w:r>
+              <w:rPr>
+                <w:b/>
+                <w:bCs/>
+              </w:rPr>
+              <w:t xml:space="preserve">Multi-Branch Footprint</w:t>
+            </w:r>
+          </w:p>
+        </w:tc>
+        <w:tc>
+          <w:tcPr>
+            <w:tcBorders>
+              <w:top w:val="single" w:color="CBD5E1" w:sz="4"/>
+              <w:left w:val="single" w:color="CBD5E1" w:sz="4"/>
+              <w:bottom w:val="single" w:color="CBD5E1" w:sz="4"/>
+              <w:right w:val="single" w:color="CBD5E1" w:sz="4"/>
+            </w:tcBorders>
+          </w:tcPr>
+          <w:p>
+            <w:r>
+              <w:t xml:space="preserve">Identifies if the company operates multiple physical branches, retail stores, showrooms, warehouses, or regional hubs across Australia.</w:t>
+            </w:r>
+          </w:p>
+        </w:tc>
+        <w:tc>
+          <w:tcPr>
+            <w:tcBorders>
+              <w:top w:val="single" w:color="CBD5E1" w:sz="4"/>
+              <w:left w:val="single" w:color="CBD5E1" w:sz="4"/>
+              <w:bottom w:val="single" w:color="CBD5E1" w:sz="4"/>
+              <w:right w:val="single" w:color="CBD5E1" w:sz="4"/>
+            </w:tcBorders>
+          </w:tcPr>
+          <w:p>
+            <w:r>
+              <w:rPr>
+                <w:b/>
+                <w:bCs/>
+                <w:color w:val="4338CA"/>
+              </w:rPr>
+              <w:t xml:space="preserve">true (🏢 Multi-Branch - 4 Locations)</w:t>
+            </w:r>
+          </w:p>
+        </w:tc>
+      </w:tr>
+      <w:tr>
+        <w:tc>
+          <w:tcPr>
+            <w:tcBorders>
+              <w:top w:val="single" w:color="CBD5E1" w:sz="4"/>
+              <w:left w:val="single" w:color="CBD5E1" w:sz="4"/>
+              <w:bottom w:val="single" w:color="CBD5E1" w:sz="4"/>
+              <w:right w:val="single" w:color="CBD5E1" w:sz="4"/>
+            </w:tcBorders>
+          </w:tcPr>
+          <w:p>
+            <w:r>
+              <w:rPr>
+                <w:b/>
+                <w:bCs/>
+              </w:rPr>
+              <w:t xml:space="preserve">Branch Locations &amp; Postcodes</w:t>
+            </w:r>
+          </w:p>
+        </w:tc>
+        <w:tc>
+          <w:tcPr>
+            <w:tcBorders>
+              <w:top w:val="single" w:color="CBD5E1" w:sz="4"/>
+              <w:left w:val="single" w:color="CBD5E1" w:sz="4"/>
+              <w:bottom w:val="single" w:color="CBD5E1" w:sz="4"/>
+              <w:right w:val="single" w:color="CBD5E1" w:sz="4"/>
+            </w:tcBorders>
+          </w:tcPr>
+          <w:p>
+            <w:r>
+              <w:t xml:space="preserve">Structured list of identified Australian branch locations capturing Suburb, State, Postcode, address, phone, and HQ role.</w:t>
+            </w:r>
+          </w:p>
+        </w:tc>
+        <w:tc>
+          <w:tcPr>
+            <w:tcBorders>
+              <w:top w:val="single" w:color="CBD5E1" w:sz="4"/>
+              <w:left w:val="single" w:color="CBD5E1" w:sz="4"/>
+              <w:bottom w:val="single" w:color="CBD5E1" w:sz="4"/>
+              <w:right w:val="single" w:color="CBD5E1" w:sz="4"/>
+            </w:tcBorders>
+          </w:tcPr>
+          <w:p>
+            <w:r>
+              <w:t xml:space="preserve">• Parramatta, NSW 2150
+• Richmond, VIC 3121
+• Fortitude Valley, QLD 4006</w:t>
             </w:r>
           </w:p>
         </w:tc>

</xml_diff>